<commit_message>
se actualizan plantillas de comisiones y encargados de comisiones
</commit_message>
<xml_diff>
--- a/templates/PLANTILLA_COMISIONES_GENERALES.docx
+++ b/templates/PLANTILLA_COMISIONES_GENERALES.docx
@@ -38,23 +38,7 @@
           <w:sz w:val="20"/>
           <w:szCs w:val="20"/>
         </w:rPr>
-        <w:t xml:space="preserve">Guadalajara, Jal., a </w:t>
-      </w:r>
-      <w:r>
-        <w:rPr>
-          <w:rFonts w:ascii="Garet" w:eastAsia="Garet" w:hAnsi="Garet" w:cs="Garet"/>
-          <w:sz w:val="20"/>
-          <w:szCs w:val="20"/>
-        </w:rPr>
-        <w:t>&lt;&lt;FECHA&gt;&gt;</w:t>
-      </w:r>
-      <w:r>
-        <w:rPr>
-          <w:rFonts w:ascii="Garet" w:eastAsia="Garet" w:hAnsi="Garet" w:cs="Garet"/>
-          <w:sz w:val="20"/>
-          <w:szCs w:val="20"/>
-        </w:rPr>
-        <w:t>.</w:t>
+        <w:t xml:space="preserve">Guadalajara, Jal., a &lt;&lt;FECHA&gt;&gt;.</w:t>
       </w:r>
     </w:p>
     <w:p>
@@ -96,87 +80,68 @@
           <w:sz w:val="20"/>
           <w:szCs w:val="20"/>
         </w:rPr>
-        <w:t xml:space="preserve"> </w:t>
-      </w:r>
-      <w:r>
+        <w:t xml:space="preserve"> &lt;&lt;OFICIO&gt;&gt;</w:t>
+      </w:r>
+      <w:r>
+        <w:rPr>
+          <w:rFonts w:ascii="Garet" w:eastAsia="Garet" w:hAnsi="Garet" w:cs="Garet"/>
+          <w:sz w:val="20"/>
+          <w:szCs w:val="20"/>
+        </w:rPr>
+        <w:t xml:space="preserve">.  </w:t>
+      </w:r>
+    </w:p>
+    <w:p>
+      <w:pPr>
+        <w:spacing w:line="276" w:lineRule="auto"/>
+        <w:jc w:val="right"/>
+        <w:rPr>
+          <w:rFonts w:ascii="Garet" w:eastAsia="Garet" w:hAnsi="Garet" w:cs="Garet"/>
+          <w:sz w:val="20"/>
+          <w:szCs w:val="20"/>
+        </w:rPr>
+      </w:pPr>
+      <w:r>
+        <w:rPr>
+          <w:rFonts w:ascii="Garet" w:eastAsia="Garet" w:hAnsi="Garet" w:cs="Garet"/>
+          <w:sz w:val="20"/>
+          <w:szCs w:val="20"/>
+        </w:rPr>
+        <w:t>Asunto: Se asigna Comisión.</w:t>
+      </w:r>
+    </w:p>
+    <w:p>
+      <w:pPr>
         <w:rPr>
           <w:rFonts w:ascii="Garet" w:eastAsia="Garet" w:hAnsi="Garet" w:cs="Garet"/>
           <w:b/>
           <w:bCs/>
-          <w:color w:val="000000"/>
-          <w:sz w:val="20"/>
-          <w:szCs w:val="20"/>
-        </w:rPr>
-        <w:t>&lt;&lt;OFICIO&gt;&gt;</w:t>
-      </w:r>
-      <w:r>
-        <w:rPr>
-          <w:rFonts w:ascii="Garet" w:eastAsia="Garet" w:hAnsi="Garet" w:cs="Garet"/>
-          <w:sz w:val="20"/>
-          <w:szCs w:val="20"/>
-        </w:rPr>
-        <w:t xml:space="preserve">.  </w:t>
-      </w:r>
-    </w:p>
-    <w:p>
-      <w:pPr>
-        <w:spacing w:line="276" w:lineRule="auto"/>
-        <w:jc w:val="right"/>
-        <w:rPr>
-          <w:rFonts w:ascii="Garet" w:eastAsia="Garet" w:hAnsi="Garet" w:cs="Garet"/>
-          <w:sz w:val="20"/>
-          <w:szCs w:val="20"/>
-        </w:rPr>
-      </w:pPr>
-      <w:r>
-        <w:rPr>
-          <w:rFonts w:ascii="Garet" w:eastAsia="Garet" w:hAnsi="Garet" w:cs="Garet"/>
-          <w:sz w:val="20"/>
-          <w:szCs w:val="20"/>
-        </w:rPr>
-        <w:t>Asunto: Se asigna Comisión.</w:t>
-      </w:r>
-    </w:p>
-    <w:p>
-      <w:pPr>
+        </w:rPr>
+      </w:pPr>
+      <w:r>
         <w:rPr>
           <w:rFonts w:ascii="Garet" w:eastAsia="Garet" w:hAnsi="Garet" w:cs="Garet"/>
           <w:b/>
           <w:bCs/>
         </w:rPr>
-      </w:pPr>
-      <w:r>
+        <w:t>&lt;&lt;NOMBRE_COMPLETO&gt;&gt;</w:t>
+      </w:r>
+    </w:p>
+    <w:p>
+      <w:pPr>
         <w:rPr>
           <w:rFonts w:ascii="Garet" w:eastAsia="Garet" w:hAnsi="Garet" w:cs="Garet"/>
           <w:b/>
           <w:bCs/>
         </w:rPr>
-        <w:t>&lt;&lt;NOMBRE_COMPLETO&gt;&gt;</w:t>
-      </w:r>
-    </w:p>
-    <w:p>
-      <w:pPr>
+      </w:pPr>
+      <w:r>
         <w:rPr>
           <w:rFonts w:ascii="Garet" w:eastAsia="Garet" w:hAnsi="Garet" w:cs="Garet"/>
           <w:b/>
           <w:bCs/>
         </w:rPr>
-      </w:pPr>
-      <w:r>
-        <w:rPr>
-          <w:rFonts w:ascii="Garet" w:eastAsia="Garet" w:hAnsi="Garet" w:cs="Garet"/>
-          <w:b/>
-          <w:bCs/>
-        </w:rPr>
-        <w:t>Asesor Pedagógico de la D</w:t>
-      </w:r>
-      <w:r>
-        <w:rPr>
-          <w:rFonts w:ascii="Garet" w:eastAsia="Garet" w:hAnsi="Garet" w:cs="Garet"/>
-          <w:b/>
-          <w:bCs/>
-        </w:rPr>
-        <w:t>irección de Formación Continua</w:t>
+        <w:t>Asesor Pedagógico de la Dirección de Formación Continua</w:t>
       </w:r>
     </w:p>
     <w:p>
@@ -206,70 +171,25 @@
           <w:szCs w:val="22"/>
         </w:rPr>
         <w:t xml:space="preserve"> </w:t>
-      </w:r>
+        <w:tab/>
+        <w:tab/>
+        <w:tab/>
+        <w:tab/>
+        <w:tab/>
+      </w:r>
+    </w:p>
+    <w:p>
+      <w:pPr>
+        <w:jc w:val="both"/>
+        <w:rPr>
+          <w:rFonts w:ascii="Garet" w:eastAsia="Garet" w:hAnsi="Garet" w:cs="Garet"/>
+        </w:rPr>
+      </w:pPr>
       <w:r>
         <w:rPr>
           <w:rFonts w:ascii="Garet" w:eastAsia="Garet" w:hAnsi="Garet" w:cs="Garet"/>
           <w:b/>
           <w:bCs/>
-          <w:sz w:val="22"/>
-          <w:szCs w:val="22"/>
-        </w:rPr>
-        <w:tab/>
-      </w:r>
-      <w:r>
-        <w:rPr>
-          <w:rFonts w:ascii="Garet" w:eastAsia="Garet" w:hAnsi="Garet" w:cs="Garet"/>
-          <w:b/>
-          <w:bCs/>
-          <w:sz w:val="22"/>
-          <w:szCs w:val="22"/>
-        </w:rPr>
-        <w:tab/>
-      </w:r>
-      <w:r>
-        <w:rPr>
-          <w:rFonts w:ascii="Garet" w:eastAsia="Garet" w:hAnsi="Garet" w:cs="Garet"/>
-          <w:b/>
-          <w:bCs/>
-          <w:sz w:val="22"/>
-          <w:szCs w:val="22"/>
-        </w:rPr>
-        <w:tab/>
-      </w:r>
-      <w:r>
-        <w:rPr>
-          <w:rFonts w:ascii="Garet" w:eastAsia="Garet" w:hAnsi="Garet" w:cs="Garet"/>
-          <w:b/>
-          <w:bCs/>
-          <w:sz w:val="22"/>
-          <w:szCs w:val="22"/>
-        </w:rPr>
-        <w:tab/>
-      </w:r>
-      <w:r>
-        <w:rPr>
-          <w:rFonts w:ascii="Garet" w:eastAsia="Garet" w:hAnsi="Garet" w:cs="Garet"/>
-          <w:b/>
-          <w:bCs/>
-          <w:sz w:val="22"/>
-          <w:szCs w:val="22"/>
-        </w:rPr>
-        <w:tab/>
-      </w:r>
-    </w:p>
-    <w:p>
-      <w:pPr>
-        <w:jc w:val="both"/>
-        <w:rPr>
-          <w:rFonts w:ascii="Garet" w:eastAsia="Garet" w:hAnsi="Garet" w:cs="Garet"/>
-        </w:rPr>
-      </w:pPr>
-      <w:r>
-        <w:rPr>
-          <w:rFonts w:ascii="Garet" w:eastAsia="Garet" w:hAnsi="Garet" w:cs="Garet"/>
-          <w:b/>
-          <w:bCs/>
         </w:rPr>
         <w:br/>
       </w:r>
@@ -277,103 +197,7 @@
         <w:rPr>
           <w:rFonts w:ascii="Garet" w:eastAsia="Garet" w:hAnsi="Garet" w:cs="Garet"/>
         </w:rPr>
-        <w:t xml:space="preserve">Con un cordial saludo me dirijo a usted para comunicarle que, en función de las actividades que se realizan para fortalecer la formación continua de los docentes en Jalisco, a partir del </w:t>
-      </w:r>
-      <w:r>
-        <w:rPr>
-          <w:rFonts w:ascii="Garet" w:eastAsia="Garet" w:hAnsi="Garet" w:cs="Garet"/>
-        </w:rPr>
-        <w:t>&lt;&lt;FECHA_INICIO&gt;&gt;</w:t>
-      </w:r>
-      <w:r>
-        <w:rPr>
-          <w:rFonts w:ascii="Garet" w:eastAsia="Garet" w:hAnsi="Garet" w:cs="Garet"/>
-        </w:rPr>
-        <w:t xml:space="preserve"> y hasta el </w:t>
-      </w:r>
-      <w:r>
-        <w:rPr>
-          <w:rFonts w:ascii="Garet" w:eastAsia="Garet" w:hAnsi="Garet" w:cs="Garet"/>
-        </w:rPr>
-        <w:t>&lt;&lt;FECHA_FIN&gt;&gt;</w:t>
-      </w:r>
-      <w:r>
-        <w:rPr>
-          <w:rFonts w:ascii="Garet" w:eastAsia="Garet" w:hAnsi="Garet" w:cs="Garet"/>
-        </w:rPr>
-        <w:t xml:space="preserve"> se le comisiona con sus horas de adscripción a esta Dirección al </w:t>
-      </w:r>
-      <w:r>
-        <w:rPr>
-          <w:rFonts w:ascii="Garet" w:eastAsia="Garet" w:hAnsi="Garet" w:cs="Garet"/>
-        </w:rPr>
-        <w:t xml:space="preserve">&lt;&lt;INSTITUCION&gt;&gt; </w:t>
-      </w:r>
-      <w:r>
-        <w:rPr>
-          <w:rFonts w:ascii="Garet" w:eastAsia="Garet" w:hAnsi="Garet" w:cs="Garet"/>
-        </w:rPr>
-        <w:t xml:space="preserve">unidad </w:t>
-      </w:r>
-      <w:r>
-        <w:rPr>
-          <w:rFonts w:ascii="Garet" w:eastAsia="Garet" w:hAnsi="Garet" w:cs="Garet"/>
-        </w:rPr>
-        <w:t>&lt;&lt;UBICACION&gt;&gt;</w:t>
-      </w:r>
-      <w:r>
-        <w:rPr>
-          <w:rFonts w:ascii="Garet" w:eastAsia="Garet" w:hAnsi="Garet" w:cs="Garet"/>
-        </w:rPr>
-        <w:t xml:space="preserve"> Autlán, ubicado en UPN 143, con domicilio en calle</w:t>
-      </w:r>
-      <w:r>
-        <w:rPr>
-          <w:rFonts w:ascii="Garet" w:eastAsia="Garet" w:hAnsi="Garet" w:cs="Garet"/>
-        </w:rPr>
-        <w:t xml:space="preserve"> &lt;&lt;DOMICILIO&gt;&gt;</w:t>
-      </w:r>
-      <w:r>
-        <w:rPr>
-          <w:rFonts w:ascii="Garet" w:eastAsia="Garet" w:hAnsi="Garet" w:cs="Garet"/>
-        </w:rPr>
-        <w:t xml:space="preserve">, Col. </w:t>
-      </w:r>
-      <w:r>
-        <w:rPr>
-          <w:rFonts w:ascii="Garet" w:eastAsia="Garet" w:hAnsi="Garet" w:cs="Garet"/>
-        </w:rPr>
-        <w:t>&lt;&lt;COLONIA&gt;&gt;</w:t>
-      </w:r>
-      <w:r>
-        <w:rPr>
-          <w:rFonts w:ascii="Garet" w:eastAsia="Garet" w:hAnsi="Garet" w:cs="Garet"/>
-        </w:rPr>
-        <w:t xml:space="preserve">, Municipio de </w:t>
-      </w:r>
-      <w:r>
-        <w:rPr>
-          <w:rFonts w:ascii="Garet" w:eastAsia="Garet" w:hAnsi="Garet" w:cs="Garet"/>
-        </w:rPr>
-        <w:t>&lt;&lt;MUNICIPIO&gt;&gt;</w:t>
-      </w:r>
-      <w:r>
-        <w:rPr>
-          <w:rFonts w:ascii="Garet" w:eastAsia="Garet" w:hAnsi="Garet" w:cs="Garet"/>
-        </w:rPr>
-        <w:t xml:space="preserve">, C.P. </w:t>
-      </w:r>
-      <w:r>
-        <w:rPr>
-          <w:rFonts w:ascii="Garet" w:eastAsia="Garet" w:hAnsi="Garet" w:cs="Garet"/>
-        </w:rPr>
-        <w:t>&lt;&lt;CP&gt;&gt;</w:t>
-      </w:r>
-      <w:r>
-        <w:rPr>
-          <w:rFonts w:ascii="Garet" w:eastAsia="Garet" w:hAnsi="Garet" w:cs="Garet"/>
-        </w:rPr>
-        <w:t xml:space="preserve"> a realizar actividades propias de la formación de docentes en la región de adscripción de dicha institución.</w:t>
+        <w:t xml:space="preserve">Con un cordial saludo me dirijo a usted para comunicarle que, en función de las actividades que se realizan para fortalecer la formación continua de los docentes en Jalisco, a partir del &lt;&lt;FECHA_INICIO&gt;&gt; y hasta el &lt;&lt;FECHA_FIN&gt;&gt; se le comisiona con sus horas de adscripción a esta Dirección, &lt;&lt;SEDE&gt;&gt;, &lt;&lt;DIRECCION&gt;&gt;, a realizar actividades propias de la formación de docentes en la región de adscripción de dicha institución.</w:t>
       </w:r>
     </w:p>
     <w:p>
@@ -718,25 +542,7 @@
           <w:sz w:val="12"/>
           <w:szCs w:val="12"/>
         </w:rPr>
-        <w:t xml:space="preserve">Este documento puede contener datos personales </w:t>
-      </w:r>
-      <w:r>
-        <w:rPr>
-          <w:rFonts w:ascii="Arial" w:eastAsia="Arial" w:hAnsi="Arial" w:cs="Arial"/>
-          <w:color w:val="000000"/>
-          <w:sz w:val="12"/>
-          <w:szCs w:val="12"/>
-        </w:rPr>
-        <w:t>de acuerdo con</w:t>
-      </w:r>
-      <w:r>
-        <w:rPr>
-          <w:rFonts w:ascii="Arial" w:eastAsia="Arial" w:hAnsi="Arial" w:cs="Arial"/>
-          <w:color w:val="000000"/>
-          <w:sz w:val="12"/>
-          <w:szCs w:val="12"/>
-        </w:rPr>
-        <w:t xml:space="preserve"> lo establecido en el artículo 3, fracciones IX y X de la Ley de Protección de Datos Personales en Posesión de Sujetos Obligados del Estado de Jalisco y sus Municipios, así como información confidencial de conformidad al artículo 21 de la Ley de Transparencia y Acceso a la Información Pública del Estado de Jalisco y sus Municipios. Atendiendo a lo establecido por el artículo 72 de la citada Ley de Protección de Datos Personales, el receptor, que adquiere el carácter de responsable, de los datos personales deberá tratar los mismos comprometiéndose a garantizar su confidencialidad y únicamente utilizarlos para los fines que le fueron transferidos. El tratamiento de esta información deberá cumplir en todo momento con las disposiciones de las leyes antes señaladas, por lo que cualquier transferencia o tratamiento de los datos por personas o entidades distintas a las dirigidas se encuentra prohibido; salvo las excepciones contempladas en los artículos 15 y 75 de la Ley de Protección de Datos Personales en Posesión de Sujetos Obligados del Estado de Jalisco y sus Municipios</w:t>
+        <w:t xml:space="preserve">Este documento puede contener datos personales de acuerdo con lo establecido en el artículo 3, fracciones IX y X de la Ley de Protección de Datos Personales en Posesión de Sujetos Obligados del Estado de Jalisco y sus Municipios, así como información confidencial de conformidad al artículo 21 de la Ley de Transparencia y Acceso a la Información Pública del Estado de Jalisco y sus Municipios. Atendiendo a lo establecido por el artículo 72 de la citada Ley de Protección de Datos Personales, el receptor, que adquiere el carácter de responsable, de los datos personales deberá tratar los mismos comprometiéndose a garantizar su confidencialidad y únicamente utilizarlos para los fines que le fueron transferidos. El tratamiento de esta información deberá cumplir en todo momento con las disposiciones de las leyes antes señaladas, por lo que cualquier transferencia o tratamiento de los datos por personas o entidades distintas a las dirigidas se encuentra prohibido; salvo las excepciones contempladas en los artículos 15 y 75 de la Ley de Protección de Datos Personales en Posesión de Sujetos Obligados del Estado de Jalisco y sus Municipios</w:t>
       </w:r>
     </w:p>
     <w:p>

</xml_diff>

<commit_message>
se actualiza leyenda en plantilas
</commit_message>
<xml_diff>
--- a/templates/PLANTILLA_COMISIONES_GENERALES.docx
+++ b/templates/PLANTILLA_COMISIONES_GENERALES.docx
@@ -38,7 +38,7 @@
           <w:sz w:val="20"/>
           <w:szCs w:val="20"/>
         </w:rPr>
-        <w:t xml:space="preserve">Guadalajara, Jal., a &lt;&lt;FECHA&gt;&gt;.</w:t>
+        <w:t>Guadalajara, Jal., a &lt;&lt;FECHA&gt;&gt;.</w:t>
       </w:r>
     </w:p>
     <w:p>
@@ -171,10 +171,55 @@
           <w:szCs w:val="22"/>
         </w:rPr>
         <w:t xml:space="preserve"> </w:t>
+      </w:r>
+      <w:r>
+        <w:rPr>
+          <w:rFonts w:ascii="Garet" w:eastAsia="Garet" w:hAnsi="Garet" w:cs="Garet"/>
+          <w:b/>
+          <w:bCs/>
+          <w:sz w:val="22"/>
+          <w:szCs w:val="22"/>
+        </w:rPr>
         <w:tab/>
+      </w:r>
+      <w:r>
+        <w:rPr>
+          <w:rFonts w:ascii="Garet" w:eastAsia="Garet" w:hAnsi="Garet" w:cs="Garet"/>
+          <w:b/>
+          <w:bCs/>
+          <w:sz w:val="22"/>
+          <w:szCs w:val="22"/>
+        </w:rPr>
         <w:tab/>
+      </w:r>
+      <w:r>
+        <w:rPr>
+          <w:rFonts w:ascii="Garet" w:eastAsia="Garet" w:hAnsi="Garet" w:cs="Garet"/>
+          <w:b/>
+          <w:bCs/>
+          <w:sz w:val="22"/>
+          <w:szCs w:val="22"/>
+        </w:rPr>
         <w:tab/>
+      </w:r>
+      <w:r>
+        <w:rPr>
+          <w:rFonts w:ascii="Garet" w:eastAsia="Garet" w:hAnsi="Garet" w:cs="Garet"/>
+          <w:b/>
+          <w:bCs/>
+          <w:sz w:val="22"/>
+          <w:szCs w:val="22"/>
+        </w:rPr>
         <w:tab/>
+      </w:r>
+      <w:r>
+        <w:rPr>
+          <w:rFonts w:ascii="Garet" w:eastAsia="Garet" w:hAnsi="Garet" w:cs="Garet"/>
+          <w:b/>
+          <w:bCs/>
+          <w:sz w:val="22"/>
+          <w:szCs w:val="22"/>
+        </w:rPr>
         <w:tab/>
       </w:r>
     </w:p>
@@ -197,7 +242,7 @@
         <w:rPr>
           <w:rFonts w:ascii="Garet" w:eastAsia="Garet" w:hAnsi="Garet" w:cs="Garet"/>
         </w:rPr>
-        <w:t xml:space="preserve">Con un cordial saludo me dirijo a usted para comunicarle que, en función de las actividades que se realizan para fortalecer la formación continua de los docentes en Jalisco, a partir del &lt;&lt;FECHA_INICIO&gt;&gt; y hasta el &lt;&lt;FECHA_FIN&gt;&gt; se le comisiona con sus horas de adscripción a esta Dirección, &lt;&lt;SEDE&gt;&gt;, &lt;&lt;DIRECCION&gt;&gt;, a realizar actividades propias de la formación de docentes en la región de adscripción de dicha institución.</w:t>
+        <w:t>Con un cordial saludo me dirijo a usted para comunicarle que, en función de las actividades que se realizan para fortalecer la formación continua de los docentes en Jalisco, a partir del &lt;&lt;FECHA_INICIO&gt;&gt; y hasta el &lt;&lt;FECHA_FIN&gt;&gt; se le comisiona con sus horas de adscripción a esta Dirección, &lt;&lt;SEDE&gt;&gt;, &lt;&lt;DIRECCION&gt;&gt;, a realizar actividades propias de la formación de docentes en la región de adscripción de dicha institución.</w:t>
       </w:r>
     </w:p>
     <w:p>
@@ -242,6 +287,69 @@
           <w:rFonts w:ascii="Garet" w:eastAsia="Garet" w:hAnsi="Garet" w:cs="Garet"/>
         </w:rPr>
         <w:t xml:space="preserve">Sin otro particular y con el deseo de que esta acción se lleve a cabo con éxito te envío un reconocimiento por el desempeño de su labor. </w:t>
+      </w:r>
+    </w:p>
+    <w:p>
+      <w:pPr>
+        <w:pBdr>
+          <w:top w:val="nil"/>
+          <w:left w:val="nil"/>
+          <w:bottom w:val="nil"/>
+          <w:right w:val="nil"/>
+          <w:between w:val="nil"/>
+        </w:pBdr>
+        <w:jc w:val="center"/>
+        <w:rPr>
+          <w:rFonts w:ascii="Garet" w:eastAsia="Garet" w:hAnsi="Garet" w:cs="Garet"/>
+          <w:b/>
+          <w:bCs/>
+          <w:color w:val="000000"/>
+          <w:sz w:val="22"/>
+          <w:szCs w:val="22"/>
+        </w:rPr>
+      </w:pPr>
+      <w:r>
+        <w:rPr>
+          <w:rFonts w:ascii="Garet" w:eastAsia="Garet" w:hAnsi="Garet" w:cs="Garet"/>
+          <w:b/>
+          <w:bCs/>
+          <w:color w:val="000000"/>
+          <w:sz w:val="22"/>
+          <w:szCs w:val="22"/>
+        </w:rPr>
+        <w:br/>
+        <w:t>A T E N T A M E N T E</w:t>
+      </w:r>
+    </w:p>
+    <w:p>
+      <w:pPr>
+        <w:pBdr>
+          <w:top w:val="nil"/>
+          <w:left w:val="nil"/>
+          <w:bottom w:val="nil"/>
+          <w:right w:val="nil"/>
+          <w:between w:val="nil"/>
+        </w:pBdr>
+        <w:jc w:val="center"/>
+        <w:rPr>
+          <w:rFonts w:ascii="Garet" w:eastAsia="Garet" w:hAnsi="Garet" w:cs="Garet"/>
+          <w:i/>
+          <w:iCs/>
+          <w:color w:val="000000"/>
+          <w:sz w:val="22"/>
+          <w:szCs w:val="22"/>
+        </w:rPr>
+      </w:pPr>
+      <w:r>
+        <w:rPr>
+          <w:rFonts w:ascii="Garet" w:eastAsia="Garet" w:hAnsi="Garet" w:cs="Garet"/>
+          <w:i/>
+          <w:iCs/>
+          <w:color w:val="000000"/>
+          <w:sz w:val="22"/>
+          <w:szCs w:val="22"/>
+        </w:rPr>
+        <w:t>"2026, Jalisco, Cuna de Identidad Nacional y el Mundial que nos Une"</w:t>
       </w:r>
     </w:p>
     <w:p>
@@ -254,28 +362,55 @@
           <w:between w:val="nil"/>
         </w:pBdr>
         <w:spacing w:line="360" w:lineRule="auto"/>
-        <w:jc w:val="center"/>
-        <w:rPr>
-          <w:rFonts w:ascii="Garet" w:eastAsia="Garet" w:hAnsi="Garet" w:cs="Garet"/>
-          <w:b/>
-          <w:bCs/>
-          <w:color w:val="000000"/>
-          <w:sz w:val="22"/>
-          <w:szCs w:val="22"/>
-        </w:rPr>
-      </w:pPr>
-      <w:r>
-        <w:rPr>
-          <w:rFonts w:ascii="Garet" w:eastAsia="Garet" w:hAnsi="Garet" w:cs="Garet"/>
-          <w:b/>
-          <w:bCs/>
-          <w:color w:val="000000"/>
-          <w:sz w:val="22"/>
-          <w:szCs w:val="22"/>
-        </w:rPr>
-        <w:br/>
-        <w:t>A T E N T A M E N T E</w:t>
-      </w:r>
+        <w:rPr>
+          <w:rFonts w:ascii="Garet" w:eastAsia="Garet" w:hAnsi="Garet" w:cs="Garet"/>
+          <w:i/>
+          <w:iCs/>
+          <w:color w:val="000000"/>
+          <w:sz w:val="22"/>
+          <w:szCs w:val="22"/>
+        </w:rPr>
+      </w:pPr>
+    </w:p>
+    <w:p>
+      <w:pPr>
+        <w:pBdr>
+          <w:top w:val="nil"/>
+          <w:left w:val="nil"/>
+          <w:bottom w:val="nil"/>
+          <w:right w:val="nil"/>
+          <w:between w:val="nil"/>
+        </w:pBdr>
+        <w:spacing w:line="360" w:lineRule="auto"/>
+        <w:rPr>
+          <w:rFonts w:ascii="Garet" w:eastAsia="Garet" w:hAnsi="Garet" w:cs="Garet"/>
+          <w:i/>
+          <w:iCs/>
+          <w:color w:val="000000"/>
+          <w:sz w:val="22"/>
+          <w:szCs w:val="22"/>
+        </w:rPr>
+      </w:pPr>
+    </w:p>
+    <w:p>
+      <w:pPr>
+        <w:pBdr>
+          <w:top w:val="nil"/>
+          <w:left w:val="nil"/>
+          <w:bottom w:val="nil"/>
+          <w:right w:val="nil"/>
+          <w:between w:val="nil"/>
+        </w:pBdr>
+        <w:spacing w:line="360" w:lineRule="auto"/>
+        <w:rPr>
+          <w:rFonts w:ascii="Garet" w:eastAsia="Garet" w:hAnsi="Garet" w:cs="Garet"/>
+          <w:i/>
+          <w:iCs/>
+          <w:color w:val="000000"/>
+          <w:sz w:val="22"/>
+          <w:szCs w:val="22"/>
+        </w:rPr>
+      </w:pPr>
     </w:p>
     <w:p>
       <w:pPr>
@@ -289,13 +424,24 @@
         <w:jc w:val="center"/>
         <w:rPr>
           <w:rFonts w:ascii="Garet" w:eastAsia="Garet" w:hAnsi="Garet" w:cs="Garet"/>
-          <w:i/>
-          <w:iCs/>
-          <w:color w:val="000000"/>
-          <w:sz w:val="20"/>
-          <w:szCs w:val="20"/>
-        </w:rPr>
-      </w:pPr>
+          <w:b/>
+          <w:bCs/>
+          <w:color w:val="000000"/>
+          <w:sz w:val="22"/>
+          <w:szCs w:val="22"/>
+        </w:rPr>
+      </w:pPr>
+      <w:r>
+        <w:rPr>
+          <w:rFonts w:ascii="Garet" w:eastAsia="Garet" w:hAnsi="Garet" w:cs="Garet"/>
+          <w:b/>
+          <w:bCs/>
+          <w:color w:val="000000"/>
+          <w:sz w:val="22"/>
+          <w:szCs w:val="22"/>
+        </w:rPr>
+        <w:t>CLAUDIA GISELA RAMÍREZ MONROY</w:t>
+      </w:r>
     </w:p>
     <w:p>
       <w:pPr>
@@ -308,54 +454,21 @@
         </w:pBdr>
         <w:jc w:val="center"/>
         <w:rPr>
-          <w:rFonts w:ascii="Garet" w:eastAsia="Garet" w:hAnsi="Garet" w:cs="Garet"/>
-          <w:i/>
-          <w:iCs/>
-          <w:color w:val="000000"/>
-          <w:sz w:val="20"/>
-          <w:szCs w:val="20"/>
-        </w:rPr>
-      </w:pPr>
-    </w:p>
-    <w:p>
-      <w:pPr>
-        <w:pBdr>
-          <w:top w:val="nil"/>
-          <w:left w:val="nil"/>
-          <w:bottom w:val="nil"/>
-          <w:right w:val="nil"/>
-          <w:between w:val="nil"/>
-        </w:pBdr>
-        <w:spacing w:line="360" w:lineRule="auto"/>
-        <w:rPr>
-          <w:rFonts w:ascii="Garet" w:eastAsia="Garet" w:hAnsi="Garet" w:cs="Garet"/>
-          <w:i/>
-          <w:iCs/>
-          <w:color w:val="000000"/>
-          <w:sz w:val="22"/>
-          <w:szCs w:val="22"/>
-        </w:rPr>
-      </w:pPr>
-    </w:p>
-    <w:p>
-      <w:pPr>
-        <w:pBdr>
-          <w:top w:val="nil"/>
-          <w:left w:val="nil"/>
-          <w:bottom w:val="nil"/>
-          <w:right w:val="nil"/>
-          <w:between w:val="nil"/>
-        </w:pBdr>
-        <w:spacing w:line="360" w:lineRule="auto"/>
-        <w:rPr>
-          <w:rFonts w:ascii="Garet" w:eastAsia="Garet" w:hAnsi="Garet" w:cs="Garet"/>
-          <w:i/>
-          <w:iCs/>
-          <w:color w:val="000000"/>
-          <w:sz w:val="22"/>
-          <w:szCs w:val="22"/>
-        </w:rPr>
-      </w:pPr>
+          <w:rFonts w:ascii="Arial" w:eastAsia="Arial" w:hAnsi="Arial" w:cs="Arial"/>
+          <w:color w:val="000000"/>
+          <w:sz w:val="22"/>
+          <w:szCs w:val="22"/>
+        </w:rPr>
+      </w:pPr>
+      <w:r>
+        <w:rPr>
+          <w:rFonts w:ascii="Arial" w:eastAsia="Arial" w:hAnsi="Arial" w:cs="Arial"/>
+          <w:color w:val="000000"/>
+          <w:sz w:val="22"/>
+          <w:szCs w:val="22"/>
+        </w:rPr>
+        <w:t xml:space="preserve">ENCARGADA DEL DESPACHO DE LA </w:t>
+      </w:r>
     </w:p>
     <w:p>
       <w:pPr>
@@ -368,24 +481,20 @@
         </w:pBdr>
         <w:jc w:val="center"/>
         <w:rPr>
-          <w:rFonts w:ascii="Garet" w:eastAsia="Garet" w:hAnsi="Garet" w:cs="Garet"/>
-          <w:b/>
-          <w:bCs/>
-          <w:color w:val="000000"/>
-          <w:sz w:val="22"/>
-          <w:szCs w:val="22"/>
-        </w:rPr>
-      </w:pPr>
-      <w:r>
-        <w:rPr>
-          <w:rFonts w:ascii="Garet" w:eastAsia="Garet" w:hAnsi="Garet" w:cs="Garet"/>
-          <w:b/>
-          <w:bCs/>
-          <w:color w:val="000000"/>
-          <w:sz w:val="22"/>
-          <w:szCs w:val="22"/>
-        </w:rPr>
-        <w:t>CLAUDIA GISELA RAMÍREZ MONROY</w:t>
+          <w:rFonts w:ascii="Arial" w:eastAsia="Arial" w:hAnsi="Arial" w:cs="Arial"/>
+          <w:color w:val="000000"/>
+          <w:sz w:val="22"/>
+          <w:szCs w:val="22"/>
+        </w:rPr>
+      </w:pPr>
+      <w:r>
+        <w:rPr>
+          <w:rFonts w:ascii="Arial" w:eastAsia="Arial" w:hAnsi="Arial" w:cs="Arial"/>
+          <w:color w:val="000000"/>
+          <w:sz w:val="22"/>
+          <w:szCs w:val="22"/>
+        </w:rPr>
+        <w:t>DIRECCIÓN DE FORMACIÓN CONTINUA</w:t>
       </w:r>
     </w:p>
     <w:p>
@@ -405,60 +514,6 @@
           <w:szCs w:val="22"/>
         </w:rPr>
       </w:pPr>
-      <w:r>
-        <w:rPr>
-          <w:rFonts w:ascii="Arial" w:eastAsia="Arial" w:hAnsi="Arial" w:cs="Arial"/>
-          <w:color w:val="000000"/>
-          <w:sz w:val="22"/>
-          <w:szCs w:val="22"/>
-        </w:rPr>
-        <w:t xml:space="preserve">ENCARGADA DEL DESPACHO DE LA </w:t>
-      </w:r>
-    </w:p>
-    <w:p>
-      <w:pPr>
-        <w:pBdr>
-          <w:top w:val="nil"/>
-          <w:left w:val="nil"/>
-          <w:bottom w:val="nil"/>
-          <w:right w:val="nil"/>
-          <w:between w:val="nil"/>
-        </w:pBdr>
-        <w:jc w:val="center"/>
-        <w:rPr>
-          <w:rFonts w:ascii="Arial" w:eastAsia="Arial" w:hAnsi="Arial" w:cs="Arial"/>
-          <w:color w:val="000000"/>
-          <w:sz w:val="22"/>
-          <w:szCs w:val="22"/>
-        </w:rPr>
-      </w:pPr>
-      <w:r>
-        <w:rPr>
-          <w:rFonts w:ascii="Arial" w:eastAsia="Arial" w:hAnsi="Arial" w:cs="Arial"/>
-          <w:color w:val="000000"/>
-          <w:sz w:val="22"/>
-          <w:szCs w:val="22"/>
-        </w:rPr>
-        <w:t>DIRECCIÓN DE FORMACIÓN CONTINUA</w:t>
-      </w:r>
-    </w:p>
-    <w:p>
-      <w:pPr>
-        <w:pBdr>
-          <w:top w:val="nil"/>
-          <w:left w:val="nil"/>
-          <w:bottom w:val="nil"/>
-          <w:right w:val="nil"/>
-          <w:between w:val="nil"/>
-        </w:pBdr>
-        <w:jc w:val="center"/>
-        <w:rPr>
-          <w:rFonts w:ascii="Arial" w:eastAsia="Arial" w:hAnsi="Arial" w:cs="Arial"/>
-          <w:color w:val="000000"/>
-          <w:sz w:val="22"/>
-          <w:szCs w:val="22"/>
-        </w:rPr>
-      </w:pPr>
     </w:p>
     <w:p>
       <w:pPr>
@@ -542,7 +597,7 @@
           <w:sz w:val="12"/>
           <w:szCs w:val="12"/>
         </w:rPr>
-        <w:t xml:space="preserve">Este documento puede contener datos personales de acuerdo con lo establecido en el artículo 3, fracciones IX y X de la Ley de Protección de Datos Personales en Posesión de Sujetos Obligados del Estado de Jalisco y sus Municipios, así como información confidencial de conformidad al artículo 21 de la Ley de Transparencia y Acceso a la Información Pública del Estado de Jalisco y sus Municipios. Atendiendo a lo establecido por el artículo 72 de la citada Ley de Protección de Datos Personales, el receptor, que adquiere el carácter de responsable, de los datos personales deberá tratar los mismos comprometiéndose a garantizar su confidencialidad y únicamente utilizarlos para los fines que le fueron transferidos. El tratamiento de esta información deberá cumplir en todo momento con las disposiciones de las leyes antes señaladas, por lo que cualquier transferencia o tratamiento de los datos por personas o entidades distintas a las dirigidas se encuentra prohibido; salvo las excepciones contempladas en los artículos 15 y 75 de la Ley de Protección de Datos Personales en Posesión de Sujetos Obligados del Estado de Jalisco y sus Municipios</w:t>
+        <w:t>Este documento puede contener datos personales de acuerdo con lo establecido en el artículo 3, fracciones IX y X de la Ley de Protección de Datos Personales en Posesión de Sujetos Obligados del Estado de Jalisco y sus Municipios, así como información confidencial de conformidad al artículo 21 de la Ley de Transparencia y Acceso a la Información Pública del Estado de Jalisco y sus Municipios. Atendiendo a lo establecido por el artículo 72 de la citada Ley de Protección de Datos Personales, el receptor, que adquiere el carácter de responsable, de los datos personales deberá tratar los mismos comprometiéndose a garantizar su confidencialidad y únicamente utilizarlos para los fines que le fueron transferidos. El tratamiento de esta información deberá cumplir en todo momento con las disposiciones de las leyes antes señaladas, por lo que cualquier transferencia o tratamiento de los datos por personas o entidades distintas a las dirigidas se encuentra prohibido; salvo las excepciones contempladas en los artículos 15 y 75 de la Ley de Protección de Datos Personales en Posesión de Sujetos Obligados del Estado de Jalisco y sus Municipios</w:t>
       </w:r>
     </w:p>
     <w:p>

</xml_diff>